<commit_message>
Reorganise le plan de correctifs en succession stricte (pas de parallele)
A la demande de l'equipe : un seul membre travaille sur app/app_v2.py a
la fois, plus de repartition par jour/fonction en parallele. Ordre de
passage fixe : Marie-Therese -> Andy -> Aristide (cloture le sprint,
volontairement en dernier pour le footer global et les ajustements
transverses qui n'ont de sens qu'une fois les autres pages stabilisees).

Chaque bloc se termine par un push + PR explicite et une passation ;
le membre suivant demarre systematiquement par un pull. Numerotation
des jours continue (J1 a J11) plutot que redemarrant par personne, pour
rendre la sequentialite non ambigue.

Co-Authored-By: Claude Sonnet 5 <noreply@anthropic.com>
</commit_message>
<xml_diff>
--- a/docs/Plan_Correctifs_Personnalisation.docx
+++ b/docs/Plan_Correctifs_Personnalisation.docx
@@ -14,7 +14,7 @@
       <w:r>
         <w:t>Plan de répartition des tâches : correctifs de personnalisation et de professionnalisation de l'application</w:t>
         <w:br/>
-        <w:t>Sprint à démarrer dès validation par l'équipe</w:t>
+        <w:t>Sprint séquentiel — un seul membre travaille à la fois sur le code</w:t>
       </w:r>
     </w:p>
     <w:p>
@@ -37,7 +37,7 @@
     </w:p>
     <w:p>
       <w:r>
-        <w:t>Répartition ci-dessous par domaine de compétence (proche des rôles déjà établis) et par page, en limitant les collisions sur app/app_v2.py — fichier central touché par les trois membres, comme lors de la semaine de marge.</w:t>
+        <w:t>Fonctionnement retenu pour ce sprint : succession stricte, pas de travail en parallèle. Un seul membre modifie app/app_v2.py à la fois ; il pousse son code dès son bloc terminé et passe la main au suivant, qui démarre par un pull. Objectif : éliminer tout risque de conflit de fusion, au prix d'un calendrier plus long que si les trois travaillaient en parallèle.</w:t>
       </w:r>
     </w:p>
     <w:p>
@@ -58,12 +58,30 @@
         <w:pStyle w:val="Heading1"/>
       </w:pPr>
       <w:r>
-        <w:t>1. Aristide (avec l'aide de Claude)</w:t>
+        <w:t>Ordre de passage</w:t>
       </w:r>
     </w:p>
     <w:p>
       <w:r>
-        <w:t>Objectif de son bloc : cohérence des couleurs de score entre pages (logique déjà appliquée cette semaine sur l'Historique, à étendre au Dashboard), export PDF, terminologie liée aux données/au modèle dans le formulaire, footer transverse.</w:t>
+        <w:t>1. Marie-Thérèse  →  2. Andy  →  3. Aristide (clôture le sprint).</w:t>
+      </w:r>
+    </w:p>
+    <w:p>
+      <w:r>
+        <w:t>Aristide clôt le plan volontairement : son bloc contient le footer global et les ajustements de cohérence transverses (couleur du score sur deux pages), qui n'ont de sens qu'une fois les pages des deux autres stabilisées.</w:t>
+      </w:r>
+    </w:p>
+    <w:p>
+      <w:pPr>
+        <w:pStyle w:val="Heading1"/>
+      </w:pPr>
+      <w:r>
+        <w:t>1. Marie-Thérèse (avec l'aide de Claude) — Jours 1 à 5</w:t>
+      </w:r>
+    </w:p>
+    <w:p>
+      <w:r>
+        <w:t>Objectif de son bloc : pages Connexion et Création de compte (son domaine d'origine, authentification), plus les compléments Dashboard et Historique liés à l'identification du demandeur. Démarre en premier : personne d'autre ne touche app/app_v2.py pendant son bloc.</w:t>
       </w:r>
     </w:p>
     <w:tbl>
@@ -127,7 +145,7 @@
           </w:tcPr>
           <w:p>
             <w:r>
-              <w:t>Formulaire Nouvelle demande : corriger le remplissage automatique du champ "Niveau d'éducation" pour les profils à risque</w:t>
+              <w:t>Vérifier ce que permet Supabase pour l'envoi d'un email de réinitialisation de mot de passe, avant de s'engager sur un calendrier précis pour "Mot de passe oublié"</w:t>
             </w:r>
           </w:p>
         </w:tc>
@@ -137,49 +155,7 @@
           </w:tcPr>
           <w:p>
             <w:r>
-              <w:t>J1</w:t>
-            </w:r>
-          </w:p>
-        </w:tc>
-        <w:tc>
-          <w:tcPr>
-            <w:tcW w:type="dxa" w:w="2160"/>
-          </w:tcPr>
-          <w:p>
-            <w:r>
-              <w:t>0,5 j</w:t>
-            </w:r>
-          </w:p>
-        </w:tc>
-        <w:tc>
-          <w:tcPr>
-            <w:tcW w:type="dxa" w:w="2160"/>
-          </w:tcPr>
-          <w:p>
-            <w:r>
-              <w:t>Un profil de démonstration doit rester cohérent avec son scénario ; l'erreur actuelle nuit à la crédibilité des exemples affichés aux utilisateurs.</w:t>
-            </w:r>
-          </w:p>
-        </w:tc>
-      </w:tr>
-      <w:tr>
-        <w:tc>
-          <w:tcPr>
-            <w:tcW w:type="dxa" w:w="2160"/>
-          </w:tcPr>
-          <w:p>
-            <w:r>
-              <w:t>Formulaire Nouvelle demande : retirer la mention "Mode : ML prédictif"</w:t>
-            </w:r>
-          </w:p>
-        </w:tc>
-        <w:tc>
-          <w:tcPr>
-            <w:tcW w:type="dxa" w:w="2160"/>
-          </w:tcPr>
-          <w:p>
-            <w:r>
-              <w:t>J1</w:t>
+              <w:t>J1 (matin)</w:t>
             </w:r>
           </w:p>
         </w:tc>
@@ -199,7 +175,7 @@
           </w:tcPr>
           <w:p>
             <w:r>
-              <w:t>Terme technique interne sans valeur pour l'utilisateur final.</w:t>
+              <w:t>Cadrer la faisabilité avant de développer ; évite de découvrir un blocage en cours de tâche.</w:t>
             </w:r>
           </w:p>
         </w:tc>
@@ -211,7 +187,7 @@
           </w:tcPr>
           <w:p>
             <w:r>
-              <w:t>Formulaire Nouvelle demande : retirer la section "Prédiction en temps réel"</w:t>
+              <w:t>Page Connexion : implémenter "Mot de passe oublié"</w:t>
             </w:r>
           </w:p>
         </w:tc>
@@ -221,7 +197,7 @@
           </w:tcPr>
           <w:p>
             <w:r>
-              <w:t>J1</w:t>
+              <w:t>J1-J2</w:t>
             </w:r>
           </w:p>
         </w:tc>
@@ -231,7 +207,7 @@
           </w:tcPr>
           <w:p>
             <w:r>
-              <w:t>0,5 j</w:t>
+              <w:t>1,5 j</w:t>
             </w:r>
           </w:p>
         </w:tc>
@@ -241,7 +217,7 @@
           </w:tcPr>
           <w:p>
             <w:r>
-              <w:t>Jugée peu utile pendant la saisie pour un utilisateur non technique ; le résultat officiel reste affiché sur la page Résultat après validation.</w:t>
+              <w:t>Fonctionnalité standard attendue sur un écran de connexion ; le lien est actuellement mort.</w:t>
             </w:r>
           </w:p>
         </w:tc>
@@ -253,7 +229,7 @@
           </w:tcPr>
           <w:p>
             <w:r>
-              <w:t>Dashboard et Historique : adapter la couleur de la barre/jauge de score à la décision (vert / orange / rouge), via une fonction utilitaire commune aux deux pages</w:t>
+              <w:t>Page Connexion : implémenter "Rester connecté"</w:t>
             </w:r>
           </w:p>
         </w:tc>
@@ -263,7 +239,7 @@
           </w:tcPr>
           <w:p>
             <w:r>
-              <w:t>J2</w:t>
+              <w:t>J2-J3</w:t>
             </w:r>
           </w:p>
         </w:tc>
@@ -273,7 +249,7 @@
           </w:tcPr>
           <w:p>
             <w:r>
-              <w:t>0,75 j</w:t>
+              <w:t>1 j</w:t>
             </w:r>
           </w:p>
         </w:tc>
@@ -283,7 +259,7 @@
           </w:tcPr>
           <w:p>
             <w:r>
-              <w:t>Cohérence visuelle immédiate entre les deux pages qui affichent un score ; une fonction commune évite que les deux pages divergent si codées séparément.</w:t>
+              <w:t>Éviter une reconnexion à chaque session pour un usage quotidien en agence.</w:t>
             </w:r>
           </w:p>
         </w:tc>
@@ -295,7 +271,7 @@
           </w:tcPr>
           <w:p>
             <w:r>
-              <w:t>Page Résultat : renommer "Secteur" en "Secteur d'activités"</w:t>
+              <w:t>Page Connexion : remplacer la phrase située sous le logo</w:t>
             </w:r>
           </w:p>
         </w:tc>
@@ -305,7 +281,7 @@
           </w:tcPr>
           <w:p>
             <w:r>
-              <w:t>J2</w:t>
+              <w:t>J3</w:t>
             </w:r>
           </w:p>
         </w:tc>
@@ -325,7 +301,7 @@
           </w:tcPr>
           <w:p>
             <w:r>
-              <w:t>Clarté du libellé.</w:t>
+              <w:t>Texte actuel jugé à revoir par l'équipe (nouveau texte à valider en amont du sprint pour ne pas bloquer cette tâche).</w:t>
             </w:r>
           </w:p>
         </w:tc>
@@ -337,49 +313,7 @@
           </w:tcPr>
           <w:p>
             <w:r>
-              <w:t>Page Export PDF : supprimer "Microfinance XYZ" de l'en-tête de l'aperçu, renommer "Catégorie" en "Catégorie de risque"</w:t>
-            </w:r>
-          </w:p>
-        </w:tc>
-        <w:tc>
-          <w:tcPr>
-            <w:tcW w:type="dxa" w:w="2160"/>
-          </w:tcPr>
-          <w:p>
-            <w:r>
-              <w:t>J2</w:t>
-            </w:r>
-          </w:p>
-        </w:tc>
-        <w:tc>
-          <w:tcPr>
-            <w:tcW w:type="dxa" w:w="2160"/>
-          </w:tcPr>
-          <w:p>
-            <w:r>
-              <w:t>0,5 j</w:t>
-            </w:r>
-          </w:p>
-        </w:tc>
-        <w:tc>
-          <w:tcPr>
-            <w:tcW w:type="dxa" w:w="2160"/>
-          </w:tcPr>
-          <w:p>
-            <w:r>
-              <w:t>Éviter un nom d'institution fictif visible sur un document destiné à être partagé avec un client ; clarté du libellé.</w:t>
-            </w:r>
-          </w:p>
-        </w:tc>
-      </w:tr>
-      <w:tr>
-        <w:tc>
-          <w:tcPr>
-            <w:tcW w:type="dxa" w:w="2160"/>
-          </w:tcPr>
-          <w:p>
-            <w:r>
-              <w:t>Ajouter un footer global (copyright, version de l'app, nom de l'app), visible sur toutes les pages</w:t>
+              <w:t>Page Connexion : ajouter un loader / spinner après validation de la connexion, jusqu'à l'arrivée sur le Dashboard</w:t>
             </w:r>
           </w:p>
         </w:tc>
@@ -409,7 +343,259 @@
           </w:tcPr>
           <w:p>
             <w:r>
-              <w:t>Élément transverse à toutes les pages : à faire une fois les textes des autres blocs stabilisés, pour éviter les retouches répétées.</w:t>
+              <w:t>Donner un retour visuel pendant l'authentification, éviter une impression de blocage de l'application.</w:t>
+            </w:r>
+          </w:p>
+        </w:tc>
+      </w:tr>
+      <w:tr>
+        <w:tc>
+          <w:tcPr>
+            <w:tcW w:type="dxa" w:w="2160"/>
+          </w:tcPr>
+          <w:p>
+            <w:r>
+              <w:t>Page Création de compte : ajouter le logo de l'application dans le formulaire</w:t>
+            </w:r>
+          </w:p>
+        </w:tc>
+        <w:tc>
+          <w:tcPr>
+            <w:tcW w:type="dxa" w:w="2160"/>
+          </w:tcPr>
+          <w:p>
+            <w:r>
+              <w:t>J4</w:t>
+            </w:r>
+          </w:p>
+        </w:tc>
+        <w:tc>
+          <w:tcPr>
+            <w:tcW w:type="dxa" w:w="2160"/>
+          </w:tcPr>
+          <w:p>
+            <w:r>
+              <w:t>0,25 j</w:t>
+            </w:r>
+          </w:p>
+        </w:tc>
+        <w:tc>
+          <w:tcPr>
+            <w:tcW w:type="dxa" w:w="2160"/>
+          </w:tcPr>
+          <w:p>
+            <w:r>
+              <w:t>Cohérence avec la page de connexion.</w:t>
+            </w:r>
+          </w:p>
+        </w:tc>
+      </w:tr>
+      <w:tr>
+        <w:tc>
+          <w:tcPr>
+            <w:tcW w:type="dxa" w:w="2160"/>
+          </w:tcPr>
+          <w:p>
+            <w:r>
+              <w:t>Page Création de compte : séparer le champ "Nom complet" en deux champs distincts "Nom" et "Prénom"</w:t>
+            </w:r>
+          </w:p>
+        </w:tc>
+        <w:tc>
+          <w:tcPr>
+            <w:tcW w:type="dxa" w:w="2160"/>
+          </w:tcPr>
+          <w:p>
+            <w:r>
+              <w:t>J4</w:t>
+            </w:r>
+          </w:p>
+        </w:tc>
+        <w:tc>
+          <w:tcPr>
+            <w:tcW w:type="dxa" w:w="2160"/>
+          </w:tcPr>
+          <w:p>
+            <w:r>
+              <w:t>0,5 j</w:t>
+            </w:r>
+          </w:p>
+        </w:tc>
+        <w:tc>
+          <w:tcPr>
+            <w:tcW w:type="dxa" w:w="2160"/>
+          </w:tcPr>
+          <w:p>
+            <w:r>
+              <w:t>Cohérence avec le formulaire Nouvelle demande (déjà 2 champs distincts) et avec la structure des données côté Supabase.</w:t>
+            </w:r>
+          </w:p>
+        </w:tc>
+      </w:tr>
+      <w:tr>
+        <w:tc>
+          <w:tcPr>
+            <w:tcW w:type="dxa" w:w="2160"/>
+          </w:tcPr>
+          <w:p>
+            <w:r>
+              <w:t>Page Création de compte : revoir le style des bordures des champs</w:t>
+            </w:r>
+          </w:p>
+        </w:tc>
+        <w:tc>
+          <w:tcPr>
+            <w:tcW w:type="dxa" w:w="2160"/>
+          </w:tcPr>
+          <w:p>
+            <w:r>
+              <w:t>J4</w:t>
+            </w:r>
+          </w:p>
+        </w:tc>
+        <w:tc>
+          <w:tcPr>
+            <w:tcW w:type="dxa" w:w="2160"/>
+          </w:tcPr>
+          <w:p>
+            <w:r>
+              <w:t>0,25 j</w:t>
+            </w:r>
+          </w:p>
+        </w:tc>
+        <w:tc>
+          <w:tcPr>
+            <w:tcW w:type="dxa" w:w="2160"/>
+          </w:tcPr>
+          <w:p>
+            <w:r>
+              <w:t>Cohérence visuelle avec les contours ambre déjà appliqués sur la page de connexion.</w:t>
+            </w:r>
+          </w:p>
+        </w:tc>
+      </w:tr>
+      <w:tr>
+        <w:tc>
+          <w:tcPr>
+            <w:tcW w:type="dxa" w:w="2160"/>
+          </w:tcPr>
+          <w:p>
+            <w:r>
+              <w:t>Dashboard : retirer l'emoji main après le texte "Bienvenue…"</w:t>
+            </w:r>
+          </w:p>
+        </w:tc>
+        <w:tc>
+          <w:tcPr>
+            <w:tcW w:type="dxa" w:w="2160"/>
+          </w:tcPr>
+          <w:p>
+            <w:r>
+              <w:t>J5</w:t>
+            </w:r>
+          </w:p>
+        </w:tc>
+        <w:tc>
+          <w:tcPr>
+            <w:tcW w:type="dxa" w:w="2160"/>
+          </w:tcPr>
+          <w:p>
+            <w:r>
+              <w:t>0,25 j</w:t>
+            </w:r>
+          </w:p>
+        </w:tc>
+        <w:tc>
+          <w:tcPr>
+            <w:tcW w:type="dxa" w:w="2160"/>
+          </w:tcPr>
+          <w:p>
+            <w:r>
+              <w:t>Renforcer le professionnalisme perçu de l'interface.</w:t>
+            </w:r>
+          </w:p>
+        </w:tc>
+      </w:tr>
+      <w:tr>
+        <w:tc>
+          <w:tcPr>
+            <w:tcW w:type="dxa" w:w="2160"/>
+          </w:tcPr>
+          <w:p>
+            <w:r>
+              <w:t>Dashboard — tableau des demandes récentes : ajouter la colonne "Nom du demandeur"</w:t>
+            </w:r>
+          </w:p>
+        </w:tc>
+        <w:tc>
+          <w:tcPr>
+            <w:tcW w:type="dxa" w:w="2160"/>
+          </w:tcPr>
+          <w:p>
+            <w:r>
+              <w:t>J5</w:t>
+            </w:r>
+          </w:p>
+        </w:tc>
+        <w:tc>
+          <w:tcPr>
+            <w:tcW w:type="dxa" w:w="2160"/>
+          </w:tcPr>
+          <w:p>
+            <w:r>
+              <w:t>0,25 j</w:t>
+            </w:r>
+          </w:p>
+        </w:tc>
+        <w:tc>
+          <w:tcPr>
+            <w:tcW w:type="dxa" w:w="2160"/>
+          </w:tcPr>
+          <w:p>
+            <w:r>
+              <w:t>Information manquante pour identifier rapidement un dossier.</w:t>
+            </w:r>
+          </w:p>
+        </w:tc>
+      </w:tr>
+      <w:tr>
+        <w:tc>
+          <w:tcPr>
+            <w:tcW w:type="dxa" w:w="2160"/>
+          </w:tcPr>
+          <w:p>
+            <w:r>
+              <w:t>Page Historique : ajouter la colonne "Nom du demandeur" et implémenter la recherche par ce champ</w:t>
+            </w:r>
+          </w:p>
+        </w:tc>
+        <w:tc>
+          <w:tcPr>
+            <w:tcW w:type="dxa" w:w="2160"/>
+          </w:tcPr>
+          <w:p>
+            <w:r>
+              <w:t>J5</w:t>
+            </w:r>
+          </w:p>
+        </w:tc>
+        <w:tc>
+          <w:tcPr>
+            <w:tcW w:type="dxa" w:w="2160"/>
+          </w:tcPr>
+          <w:p>
+            <w:r>
+              <w:t>0,75 j</w:t>
+            </w:r>
+          </w:p>
+        </w:tc>
+        <w:tc>
+          <w:tcPr>
+            <w:tcW w:type="dxa" w:w="2160"/>
+          </w:tcPr>
+          <w:p>
+            <w:r>
+              <w:t>Retrouver rapidement un dossier sans parcourir toute la liste ; cohérence avec le Dashboard.</w:t>
             </w:r>
           </w:p>
         </w:tc>
@@ -417,7 +603,7 @@
     </w:tbl>
     <w:p>
       <w:r>
-        <w:t>Total estimé : ~3 jours.</w:t>
+        <w:t>Total : ~5 jours. Fin de bloc : Marie-Thérèse pousse son code sur sa branche, ouvre sa Pull Request, et prévient Andy que la main est passée.</w:t>
       </w:r>
     </w:p>
     <w:p>
@@ -425,12 +611,12 @@
         <w:pStyle w:val="Heading1"/>
       </w:pPr>
       <w:r>
-        <w:t>2. Andy (avec l'aide de Claude)</w:t>
+        <w:t>2. Andy (avec l'aide de Claude) — Jours 6 à 8</w:t>
       </w:r>
     </w:p>
     <w:p>
       <w:r>
-        <w:t>Objectif de son bloc : SHAP (son domaine), plus les items du formulaire à faible risque de collision avec le reste de l'équipe, et l'étude conditionnelle du multilingue.</w:t>
+        <w:t>Démarre par un pull des changements de Marie-Thérèse. Objectif de son bloc : SHAP (son domaine), plus les items du formulaire, et l'étude conditionnelle du multilingue en dernier.</w:t>
       </w:r>
     </w:p>
     <w:tbl>
@@ -494,6 +680,48 @@
           </w:tcPr>
           <w:p>
             <w:r>
+              <w:t>Pull des changements de Marie-Thérèse avant de démarrer</w:t>
+            </w:r>
+          </w:p>
+        </w:tc>
+        <w:tc>
+          <w:tcPr>
+            <w:tcW w:type="dxa" w:w="2160"/>
+          </w:tcPr>
+          <w:p>
+            <w:r>
+              <w:t>J6 (matin)</w:t>
+            </w:r>
+          </w:p>
+        </w:tc>
+        <w:tc>
+          <w:tcPr>
+            <w:tcW w:type="dxa" w:w="2160"/>
+          </w:tcPr>
+          <w:p>
+            <w:r>
+              <w:t>—</w:t>
+            </w:r>
+          </w:p>
+        </w:tc>
+        <w:tc>
+          <w:tcPr>
+            <w:tcW w:type="dxa" w:w="2160"/>
+          </w:tcPr>
+          <w:p>
+            <w:r>
+              <w:t>Repartir d'un code à jour, éviter de travailler sur une version obsolète.</w:t>
+            </w:r>
+          </w:p>
+        </w:tc>
+      </w:tr>
+      <w:tr>
+        <w:tc>
+          <w:tcPr>
+            <w:tcW w:type="dxa" w:w="2160"/>
+          </w:tcPr>
+          <w:p>
+            <w:r>
               <w:t>Page Résultat : créer un bouton "Facteurs explicatifs SHAP" qui affiche les graphiques SHAP à la demande (masqués par défaut à l'arrivée sur la page)</w:t>
             </w:r>
           </w:p>
@@ -504,7 +732,7 @@
           </w:tcPr>
           <w:p>
             <w:r>
-              <w:t>J1</w:t>
+              <w:t>J6</w:t>
             </w:r>
           </w:p>
         </w:tc>
@@ -546,7 +774,7 @@
           </w:tcPr>
           <w:p>
             <w:r>
-              <w:t>J1</w:t>
+              <w:t>J7</w:t>
             </w:r>
           </w:p>
         </w:tc>
@@ -588,7 +816,7 @@
           </w:tcPr>
           <w:p>
             <w:r>
-              <w:t>J2</w:t>
+              <w:t>J7</w:t>
             </w:r>
           </w:p>
         </w:tc>
@@ -630,7 +858,7 @@
           </w:tcPr>
           <w:p>
             <w:r>
-              <w:t>J2</w:t>
+              <w:t>J7</w:t>
             </w:r>
           </w:p>
         </w:tc>
@@ -662,7 +890,7 @@
           </w:tcPr>
           <w:p>
             <w:r>
-              <w:t>Dashboard : étudier la faisabilité d'une gestion multilingue — à implémenter uniquement si aucun risque de complication n'est identifié (feature conditionnelle, non bloquante pour le reste du plan)</w:t>
+              <w:t>Dashboard : étudier la faisabilité d'une gestion multilingue — à implémenter uniquement si aucun risque de complication n'est identifié (feature conditionnelle, non bloquante pour la suite)</w:t>
             </w:r>
           </w:p>
         </w:tc>
@@ -672,7 +900,7 @@
           </w:tcPr>
           <w:p>
             <w:r>
-              <w:t>J3</w:t>
+              <w:t>J8</w:t>
             </w:r>
           </w:p>
         </w:tc>
@@ -692,7 +920,7 @@
           </w:tcPr>
           <w:p>
             <w:r>
-              <w:t>Explicitement conditionnel : ne pas retarder la livraison du reste du sprint si la complexité s'avère trop élevée.</w:t>
+              <w:t>Explicitement conditionnel : ne pas retarder la passation à Aristide si la complexité s'avère trop élevée — dans ce cas, documenter le blocage et passer la main quand même.</w:t>
             </w:r>
           </w:p>
         </w:tc>
@@ -700,7 +928,7 @@
     </w:tbl>
     <w:p>
       <w:r>
-        <w:t>Total estimé : ~3 jours (dont 1 jour conditionnel, multilingue).</w:t>
+        <w:t>Total : ~3 jours (dont 1 jour conditionnel, plafonné, pour le multilingue). Fin de bloc : Andy pousse son code, ouvre sa Pull Request, et prévient Aristide que la main est passée.</w:t>
       </w:r>
     </w:p>
     <w:p>
@@ -708,12 +936,12 @@
         <w:pStyle w:val="Heading1"/>
       </w:pPr>
       <w:r>
-        <w:t>3. Marie-Thérèse (avec l'aide de Claude)</w:t>
+        <w:t>3. Aristide (avec l'aide de Claude) — Jours 9 à 11 — clôture le sprint</w:t>
       </w:r>
     </w:p>
     <w:p>
       <w:r>
-        <w:t>Objectif de son bloc : pages Connexion et Création de compte (son domaine d'origine, authentification), plus les compléments Dashboard et Historique liés à l'identification du demandeur.</w:t>
+        <w:t>Démarre par un pull des changements de Marie-Thérèse et d'Andy. Objectif de son bloc : cohérence des couleurs de score entre pages, export PDF, terminologie liée aux données/au modèle, et le footer global — volontairement en dernier car transverse à toutes les pages désormais stabilisées.</w:t>
       </w:r>
     </w:p>
     <w:tbl>
@@ -777,7 +1005,7 @@
           </w:tcPr>
           <w:p>
             <w:r>
-              <w:t>Page Connexion : implémenter "Mot de passe oublié" — vérifier dès J1 ce que permet Supabase (envoi d'email de réinitialisation) avant de s'engager sur un calendrier précis</w:t>
+              <w:t>Pull des changements de Marie-Thérèse et d'Andy avant de démarrer</w:t>
             </w:r>
           </w:p>
         </w:tc>
@@ -787,7 +1015,7 @@
           </w:tcPr>
           <w:p>
             <w:r>
-              <w:t>J1-J2</w:t>
+              <w:t>J9 (matin)</w:t>
             </w:r>
           </w:p>
         </w:tc>
@@ -797,7 +1025,7 @@
           </w:tcPr>
           <w:p>
             <w:r>
-              <w:t>1,5 j</w:t>
+              <w:t>—</w:t>
             </w:r>
           </w:p>
         </w:tc>
@@ -807,7 +1035,7 @@
           </w:tcPr>
           <w:p>
             <w:r>
-              <w:t>Fonctionnalité standard attendue sur un écran de connexion ; le lien est actuellement mort.</w:t>
+              <w:t>Repartir d'un code à jour, éviter de travailler sur une version obsolète.</w:t>
             </w:r>
           </w:p>
         </w:tc>
@@ -819,7 +1047,7 @@
           </w:tcPr>
           <w:p>
             <w:r>
-              <w:t>Page Connexion : implémenter "Rester connecté"</w:t>
+              <w:t>Formulaire Nouvelle demande : corriger le remplissage automatique du champ "Niveau d'éducation" pour les profils à risque</w:t>
             </w:r>
           </w:p>
         </w:tc>
@@ -829,7 +1057,7 @@
           </w:tcPr>
           <w:p>
             <w:r>
-              <w:t>J1-J2</w:t>
+              <w:t>J9</w:t>
             </w:r>
           </w:p>
         </w:tc>
@@ -839,7 +1067,7 @@
           </w:tcPr>
           <w:p>
             <w:r>
-              <w:t>1 j</w:t>
+              <w:t>0,5 j</w:t>
             </w:r>
           </w:p>
         </w:tc>
@@ -849,7 +1077,7 @@
           </w:tcPr>
           <w:p>
             <w:r>
-              <w:t>Éviter une reconnexion à chaque session pour un usage quotidien en agence.</w:t>
+              <w:t>Un profil de démonstration doit rester cohérent avec son scénario ; l'erreur actuelle nuit à la crédibilité des exemples affichés aux utilisateurs.</w:t>
             </w:r>
           </w:p>
         </w:tc>
@@ -861,7 +1089,7 @@
           </w:tcPr>
           <w:p>
             <w:r>
-              <w:t>Page Connexion : remplacer la phrase située sous le logo</w:t>
+              <w:t>Formulaire Nouvelle demande : retirer la mention "Mode : ML prédictif"</w:t>
             </w:r>
           </w:p>
         </w:tc>
@@ -871,7 +1099,7 @@
           </w:tcPr>
           <w:p>
             <w:r>
-              <w:t>J1</w:t>
+              <w:t>J9</w:t>
             </w:r>
           </w:p>
         </w:tc>
@@ -891,7 +1119,7 @@
           </w:tcPr>
           <w:p>
             <w:r>
-              <w:t>Texte actuel jugé à revoir par l'équipe (nouveau texte à définir ensemble avant implémentation).</w:t>
+              <w:t>Terme technique interne sans valeur pour l'utilisateur final.</w:t>
             </w:r>
           </w:p>
         </w:tc>
@@ -903,7 +1131,7 @@
           </w:tcPr>
           <w:p>
             <w:r>
-              <w:t>Page Connexion : ajouter un loader / spinner après validation de la connexion, jusqu'à l'arrivée sur le Dashboard</w:t>
+              <w:t>Formulaire Nouvelle demande : retirer la section "Prédiction en temps réel"</w:t>
             </w:r>
           </w:p>
         </w:tc>
@@ -913,7 +1141,7 @@
           </w:tcPr>
           <w:p>
             <w:r>
-              <w:t>J2</w:t>
+              <w:t>J9</w:t>
             </w:r>
           </w:p>
         </w:tc>
@@ -933,7 +1161,7 @@
           </w:tcPr>
           <w:p>
             <w:r>
-              <w:t>Donner un retour visuel pendant l'authentification, éviter une impression de blocage de l'application.</w:t>
+              <w:t>Jugée peu utile pendant la saisie pour un utilisateur non technique ; le résultat officiel reste affiché sur la page Résultat après validation.</w:t>
             </w:r>
           </w:p>
         </w:tc>
@@ -945,7 +1173,7 @@
           </w:tcPr>
           <w:p>
             <w:r>
-              <w:t>Page Création de compte : ajouter le logo de l'application dans le formulaire</w:t>
+              <w:t>Dashboard et Historique : adapter la couleur de la barre/jauge de score à la décision (vert / orange / rouge), via une fonction utilitaire commune aux deux pages</w:t>
             </w:r>
           </w:p>
         </w:tc>
@@ -955,7 +1183,49 @@
           </w:tcPr>
           <w:p>
             <w:r>
-              <w:t>J3</w:t>
+              <w:t>J10</w:t>
+            </w:r>
+          </w:p>
+        </w:tc>
+        <w:tc>
+          <w:tcPr>
+            <w:tcW w:type="dxa" w:w="2160"/>
+          </w:tcPr>
+          <w:p>
+            <w:r>
+              <w:t>0,75 j</w:t>
+            </w:r>
+          </w:p>
+        </w:tc>
+        <w:tc>
+          <w:tcPr>
+            <w:tcW w:type="dxa" w:w="2160"/>
+          </w:tcPr>
+          <w:p>
+            <w:r>
+              <w:t>Cohérence visuelle immédiate entre les deux pages qui affichent un score ; une fonction commune évite que les deux pages divergent.</w:t>
+            </w:r>
+          </w:p>
+        </w:tc>
+      </w:tr>
+      <w:tr>
+        <w:tc>
+          <w:tcPr>
+            <w:tcW w:type="dxa" w:w="2160"/>
+          </w:tcPr>
+          <w:p>
+            <w:r>
+              <w:t>Page Résultat : renommer "Secteur" en "Secteur d'activités"</w:t>
+            </w:r>
+          </w:p>
+        </w:tc>
+        <w:tc>
+          <w:tcPr>
+            <w:tcW w:type="dxa" w:w="2160"/>
+          </w:tcPr>
+          <w:p>
+            <w:r>
+              <w:t>J10</w:t>
             </w:r>
           </w:p>
         </w:tc>
@@ -975,7 +1245,7 @@
           </w:tcPr>
           <w:p>
             <w:r>
-              <w:t>Cohérence avec la page de connexion.</w:t>
+              <w:t>Clarté du libellé.</w:t>
             </w:r>
           </w:p>
         </w:tc>
@@ -987,7 +1257,7 @@
           </w:tcPr>
           <w:p>
             <w:r>
-              <w:t>Page Création de compte : séparer le champ "Nom complet" en deux champs distincts "Nom" et "Prénom"</w:t>
+              <w:t>Page Export PDF : supprimer "Microfinance XYZ" de l'en-tête de l'aperçu, renommer "Catégorie" en "Catégorie de risque"</w:t>
             </w:r>
           </w:p>
         </w:tc>
@@ -997,7 +1267,7 @@
           </w:tcPr>
           <w:p>
             <w:r>
-              <w:t>J3</w:t>
+              <w:t>J10</w:t>
             </w:r>
           </w:p>
         </w:tc>
@@ -1017,7 +1287,7 @@
           </w:tcPr>
           <w:p>
             <w:r>
-              <w:t>Cohérence avec le formulaire Nouvelle demande (déjà 2 champs distincts) et avec la structure des données côté Supabase.</w:t>
+              <w:t>Éviter un nom d'institution fictif visible sur un document destiné à être partagé avec un client ; clarté du libellé.</w:t>
             </w:r>
           </w:p>
         </w:tc>
@@ -1029,7 +1299,7 @@
           </w:tcPr>
           <w:p>
             <w:r>
-              <w:t>Page Création de compte : revoir le style des bordures des champs</w:t>
+              <w:t>Ajouter un footer global (copyright, version de l'app, nom de l'app), visible sur toutes les pages</w:t>
             </w:r>
           </w:p>
         </w:tc>
@@ -1039,175 +1309,7 @@
           </w:tcPr>
           <w:p>
             <w:r>
-              <w:t>J3</w:t>
-            </w:r>
-          </w:p>
-        </w:tc>
-        <w:tc>
-          <w:tcPr>
-            <w:tcW w:type="dxa" w:w="2160"/>
-          </w:tcPr>
-          <w:p>
-            <w:r>
-              <w:t>0,25 j</w:t>
-            </w:r>
-          </w:p>
-        </w:tc>
-        <w:tc>
-          <w:tcPr>
-            <w:tcW w:type="dxa" w:w="2160"/>
-          </w:tcPr>
-          <w:p>
-            <w:r>
-              <w:t>Cohérence visuelle avec les contours ambre déjà appliqués sur la page de connexion.</w:t>
-            </w:r>
-          </w:p>
-        </w:tc>
-      </w:tr>
-      <w:tr>
-        <w:tc>
-          <w:tcPr>
-            <w:tcW w:type="dxa" w:w="2160"/>
-          </w:tcPr>
-          <w:p>
-            <w:r>
-              <w:t>Dashboard : retirer l'emoji main après le texte "Bienvenue…"</w:t>
-            </w:r>
-          </w:p>
-        </w:tc>
-        <w:tc>
-          <w:tcPr>
-            <w:tcW w:type="dxa" w:w="2160"/>
-          </w:tcPr>
-          <w:p>
-            <w:r>
-              <w:t>J4</w:t>
-            </w:r>
-          </w:p>
-        </w:tc>
-        <w:tc>
-          <w:tcPr>
-            <w:tcW w:type="dxa" w:w="2160"/>
-          </w:tcPr>
-          <w:p>
-            <w:r>
-              <w:t>0,25 j</w:t>
-            </w:r>
-          </w:p>
-        </w:tc>
-        <w:tc>
-          <w:tcPr>
-            <w:tcW w:type="dxa" w:w="2160"/>
-          </w:tcPr>
-          <w:p>
-            <w:r>
-              <w:t>Renforcer le professionnalisme perçu de l'interface.</w:t>
-            </w:r>
-          </w:p>
-        </w:tc>
-      </w:tr>
-      <w:tr>
-        <w:tc>
-          <w:tcPr>
-            <w:tcW w:type="dxa" w:w="2160"/>
-          </w:tcPr>
-          <w:p>
-            <w:r>
-              <w:t>Dashboard — tableau des demandes récentes : ajouter la colonne "Nom du demandeur"</w:t>
-            </w:r>
-          </w:p>
-        </w:tc>
-        <w:tc>
-          <w:tcPr>
-            <w:tcW w:type="dxa" w:w="2160"/>
-          </w:tcPr>
-          <w:p>
-            <w:r>
-              <w:t>J4</w:t>
-            </w:r>
-          </w:p>
-        </w:tc>
-        <w:tc>
-          <w:tcPr>
-            <w:tcW w:type="dxa" w:w="2160"/>
-          </w:tcPr>
-          <w:p>
-            <w:r>
-              <w:t>0,25 j</w:t>
-            </w:r>
-          </w:p>
-        </w:tc>
-        <w:tc>
-          <w:tcPr>
-            <w:tcW w:type="dxa" w:w="2160"/>
-          </w:tcPr>
-          <w:p>
-            <w:r>
-              <w:t>Information manquante pour identifier rapidement un dossier.</w:t>
-            </w:r>
-          </w:p>
-        </w:tc>
-      </w:tr>
-      <w:tr>
-        <w:tc>
-          <w:tcPr>
-            <w:tcW w:type="dxa" w:w="2160"/>
-          </w:tcPr>
-          <w:p>
-            <w:r>
-              <w:t>Page Historique : ajouter la colonne "Nom du demandeur"</w:t>
-            </w:r>
-          </w:p>
-        </w:tc>
-        <w:tc>
-          <w:tcPr>
-            <w:tcW w:type="dxa" w:w="2160"/>
-          </w:tcPr>
-          <w:p>
-            <w:r>
-              <w:t>J4</w:t>
-            </w:r>
-          </w:p>
-        </w:tc>
-        <w:tc>
-          <w:tcPr>
-            <w:tcW w:type="dxa" w:w="2160"/>
-          </w:tcPr>
-          <w:p>
-            <w:r>
-              <w:t>0,25 j</w:t>
-            </w:r>
-          </w:p>
-        </w:tc>
-        <w:tc>
-          <w:tcPr>
-            <w:tcW w:type="dxa" w:w="2160"/>
-          </w:tcPr>
-          <w:p>
-            <w:r>
-              <w:t>Idem, cohérence avec le Dashboard.</w:t>
-            </w:r>
-          </w:p>
-        </w:tc>
-      </w:tr>
-      <w:tr>
-        <w:tc>
-          <w:tcPr>
-            <w:tcW w:type="dxa" w:w="2160"/>
-          </w:tcPr>
-          <w:p>
-            <w:r>
-              <w:t>Page Historique : implémenter la recherche par "Nom du demandeur"</w:t>
-            </w:r>
-          </w:p>
-        </w:tc>
-        <w:tc>
-          <w:tcPr>
-            <w:tcW w:type="dxa" w:w="2160"/>
-          </w:tcPr>
-          <w:p>
-            <w:r>
-              <w:t>J5</w:t>
+              <w:t>J11</w:t>
             </w:r>
           </w:p>
         </w:tc>
@@ -1227,7 +1329,7 @@
           </w:tcPr>
           <w:p>
             <w:r>
-              <w:t>Retrouver rapidement un dossier sans parcourir toute la liste.</w:t>
+              <w:t>Élément transverse à toutes les pages : fait en dernier, une fois les textes de tout le monde stabilisés, pour éviter les retouches répétées.</w:t>
             </w:r>
           </w:p>
         </w:tc>
@@ -1235,7 +1337,7 @@
     </w:tbl>
     <w:p>
       <w:r>
-        <w:t>Total estimé : ~5 jours.</w:t>
+        <w:t>Total : ~3 jours. Fin de bloc : Aristide pousse son code, intègre l'ensemble via Pull Request vers main — clôture du sprint.</w:t>
       </w:r>
     </w:p>
     <w:p>
@@ -1243,7 +1345,7 @@
         <w:pStyle w:val="Heading1"/>
       </w:pPr>
       <w:r>
-        <w:t>4. Ordre de succession (points de vigilance)</w:t>
+        <w:t>4. Règles de passation (points de vigilance)</w:t>
       </w:r>
     </w:p>
     <w:p>
@@ -1251,7 +1353,7 @@
         <w:pStyle w:val="ListBullet"/>
       </w:pPr>
       <w:r>
-        <w:t>app/app_v2.py est touché par les trois personnes cette semaine — comme lors de la semaine de marge, chacun travaille sur des fonctions/pages distinctes (page_connexion et page_register pour Marie-Thérèse ; page_resultats, page_export_pdf et le formulaire pour Aristide et Andy) pour limiter les conflits de fusion.</w:t>
+        <w:t>Un seul membre modifie app/app_v2.py à la fois — pas de travail en parallèle sur le code cette fois-ci, contrairement à la semaine de marge : le calendrier est plus long, mais aucun conflit de fusion n'est possible.</w:t>
       </w:r>
     </w:p>
     <w:p>
@@ -1259,7 +1361,7 @@
         <w:pStyle w:val="ListBullet"/>
       </w:pPr>
       <w:r>
-        <w:t>Le multilingue (Andy, bloc conditionnel) est volontairement séquencé en dernier dans son bloc : fait trop tôt, tout texte modifié ensuite par les autres devrait être retraduit.</w:t>
+        <w:t>Chaque bloc se termine par un push explicite (et une Pull Request) avant la passation ; le membre suivant démarre systématiquement par un pull, jamais sur une copie locale non synchronisée.</w:t>
       </w:r>
     </w:p>
     <w:p>
@@ -1267,7 +1369,7 @@
         <w:pStyle w:val="ListBullet"/>
       </w:pPr>
       <w:r>
-        <w:t>La couleur du score (Aristide) touche à la fois le Dashboard et l'Historique dans une même tâche, via une fonction commune, pour éviter que les deux pages soient codées séparément et divergent.</w:t>
+        <w:t>"Mot de passe oublié" (Marie-Thérèse) dépend de ce que permet Supabase — à valider dès J1 avant d'estimer plus précisément la suite de son bloc ; un retard ici décale tout le calendrier.</w:t>
       </w:r>
     </w:p>
     <w:p>
@@ -1275,7 +1377,7 @@
         <w:pStyle w:val="ListBullet"/>
       </w:pPr>
       <w:r>
-        <w:t>"Mot de passe oublié" (Marie-Thérèse) dépend de ce que permet Supabase en matière d'envoi d'email — à valider dès J1 avant d'estimer plus précisément la suite de son bloc.</w:t>
+        <w:t>Le texte sous le logo de la page de connexion doit être choisi par l'équipe avant J1, pour ne pas bloquer Marie-Thérèse en cours de bloc.</w:t>
       </w:r>
     </w:p>
     <w:p>
@@ -1283,7 +1385,7 @@
         <w:pStyle w:val="ListBullet"/>
       </w:pPr>
       <w:r>
-        <w:t>Pull fréquent recommandé (au moins une fois par demi-journée) pour limiter les divergences prolongées sur app_v2.py.</w:t>
+        <w:t>Le multilingue (Andy, J8) reste conditionnel et plafonné à 1 jour : s'il n'est pas concluant, Andy documente le blocage et passe la main à Aristide sans attendre — la fin du sprint ne doit pas glisser à cause de cet item.</w:t>
       </w:r>
     </w:p>
     <w:p>
@@ -1296,7 +1398,7 @@
     </w:p>
     <w:p>
       <w:r>
-        <w:t>Point d'avancement à mi-sprint (date à fixer en équipe) : vérifier en priorité l'état de "Mot de passe oublié" et du multilingue conditionnel, les deux items les plus incertains en durée.</w:t>
+        <w:t>Point d'avancement à chaque passation (fin de bloc de Marie-Thérèse, fin de bloc d'Andy) : rapide validation de ce qui a été fait avant que le membre suivant ne démarre, pour repartir sur une base commune claire.</w:t>
       </w:r>
     </w:p>
     <w:p>

</xml_diff>

<commit_message>
Resserre le calendrier du plan de correctifs a 5 jours (max 1 semaine)
A la demande de l'equipe : demarrage des ce soir (lundi 7 septembre
2026), durees compressees et exprimees en heures plutot qu'en journees
pleines pour refleter une reactivite effective attendue de chaque
membre. Calendrier cible : lun 7 (soir) -> ven 11 septembre (5 jours
calendaires), limite absolue lun 14 septembre (1 semaine) si un bloc
deborde.

Ordre de passage inchange (Marie-Therese -> Andy -> Aristide, cloture),
duree totale ramenee de ~11 jours a ~35h reparties sur les 3 blocs
(~16h / ~10h plafonnees / ~9h).

Co-Authored-By: Claude Sonnet 5 <noreply@anthropic.com>
</commit_message>
<xml_diff>
--- a/docs/Plan_Correctifs_Personnalisation.docx
+++ b/docs/Plan_Correctifs_Personnalisation.docx
@@ -14,7 +14,7 @@
       <w:r>
         <w:t>Plan de répartition des tâches : correctifs de personnalisation et de professionnalisation de l'application</w:t>
         <w:br/>
-        <w:t>Sprint séquentiel — un seul membre travaille à la fois sur le code</w:t>
+        <w:t>Sprint séquentiel resserré — démarrage lundi 7 septembre 2026 (soirée), objectif 5 jours calendaires, 1 semaine maximum</w:t>
       </w:r>
     </w:p>
     <w:p>
@@ -32,12 +32,12 @@
     </w:p>
     <w:p>
       <w:r>
-        <w:t>Suite à une analyse menée en groupe, une liste de correctifs a été établie pour rendre l'application plus personnalisée et plus professionnelle : textes et comportements par défaut à revoir, éléments techniques visibles à retirer de l'expérience utilisateur, cohérences visuelles manquantes entre pages.</w:t>
+        <w:t>Suite à une analyse menée en groupe, une liste de correctifs a été établie pour rendre l'application plus personnalisée et plus professionnelle. Calendrier volontairement resserré : démarrage dès ce lundi 7 septembre 2026 en soirée, avec une réactivité effective attendue de chaque membre — objectif 5 jours calendaires, 1 semaine au maximum si un bloc déborde.</w:t>
       </w:r>
     </w:p>
     <w:p>
       <w:r>
-        <w:t>Fonctionnement retenu pour ce sprint : succession stricte, pas de travail en parallèle. Un seul membre modifie app/app_v2.py à la fois ; il pousse son code dès son bloc terminé et passe la main au suivant, qui démarre par un pull. Objectif : éliminer tout risque de conflit de fusion, au prix d'un calendrier plus long que si les trois travaillaient en parallèle.</w:t>
+        <w:t>Fonctionnement retenu : succession stricte, pas de travail en parallèle sur le code. Un seul membre modifie app/app_v2.py à la fois ; il pousse son code dès son bloc terminé et passe la main au suivant, qui démarre par un pull sans délai.</w:t>
       </w:r>
     </w:p>
     <w:p>
@@ -50,7 +50,7 @@
     </w:p>
     <w:p>
       <w:r>
-        <w:t>Chaque page doit refléter un choix assumé par l'équipe (texte, comportement, terminologie) plutôt qu'une valeur par défaut, un élément technique interne, ou un doublon entre pages.</w:t>
+        <w:t>Chaque page doit refléter un choix assumé par l'équipe (texte, comportement, terminologie) plutôt qu'une valeur par défaut, un élément technique interne, ou un doublon entre pages — livré en 5 jours calendaires si possible, 7 jours au grand maximum.</w:t>
       </w:r>
     </w:p>
     <w:p>
@@ -58,12 +58,17 @@
         <w:pStyle w:val="Heading1"/>
       </w:pPr>
       <w:r>
-        <w:t>Ordre de passage</w:t>
+        <w:t>Ordre de passage et calendrier cible</w:t>
       </w:r>
     </w:p>
     <w:p>
       <w:r>
-        <w:t>1. Marie-Thérèse  →  2. Andy  →  3. Aristide (clôture le sprint).</w:t>
+        <w:t>1. Marie-Thérèse (lun 7 sept, soir → mar 8 sept)  →  2. Andy (mer 9 sept)  →  3. Aristide (jeu 10 → ven 11 sept, clôture le sprint).</w:t>
+      </w:r>
+    </w:p>
+    <w:p>
+      <w:r>
+        <w:t>Si un bloc déborde malgré tout, la limite absolue reste lundi 14 septembre 2026 (1 semaine après le démarrage).</w:t>
       </w:r>
     </w:p>
     <w:p>
@@ -76,12 +81,12 @@
         <w:pStyle w:val="Heading1"/>
       </w:pPr>
       <w:r>
-        <w:t>1. Marie-Thérèse (avec l'aide de Claude) — Jours 1 à 5</w:t>
+        <w:t>1. Marie-Thérèse (avec l'aide de Claude) — lun 7 sept (soir) → mar 8 sept</w:t>
       </w:r>
     </w:p>
     <w:p>
       <w:r>
-        <w:t>Objectif de son bloc : pages Connexion et Création de compte (son domaine d'origine, authentification), plus les compléments Dashboard et Historique liés à l'identification du demandeur. Démarre en premier : personne d'autre ne touche app/app_v2.py pendant son bloc.</w:t>
+        <w:t>Objectif de son bloc : pages Connexion et Création de compte, plus les compléments Dashboard et Historique liés à l'identification du demandeur. Démarre ce soir : personne d'autre ne touche app/app_v2.py pendant son bloc.</w:t>
       </w:r>
     </w:p>
     <w:tbl>
@@ -113,7 +118,7 @@
           </w:tcPr>
           <w:p>
             <w:r>
-              <w:t>Jour</w:t>
+              <w:t>Moment</w:t>
             </w:r>
           </w:p>
         </w:tc>
@@ -145,7 +150,7 @@
           </w:tcPr>
           <w:p>
             <w:r>
-              <w:t>Vérifier ce que permet Supabase pour l'envoi d'un email de réinitialisation de mot de passe, avant de s'engager sur un calendrier précis pour "Mot de passe oublié"</w:t>
+              <w:t>Vérifier ce que permet Supabase pour l'envoi d'un email de réinitialisation de mot de passe</w:t>
             </w:r>
           </w:p>
         </w:tc>
@@ -155,7 +160,7 @@
           </w:tcPr>
           <w:p>
             <w:r>
-              <w:t>J1 (matin)</w:t>
+              <w:t>Lun 7 sept (soir)</w:t>
             </w:r>
           </w:p>
         </w:tc>
@@ -165,7 +170,7 @@
           </w:tcPr>
           <w:p>
             <w:r>
-              <w:t>0,25 j</w:t>
+              <w:t>1 h</w:t>
             </w:r>
           </w:p>
         </w:tc>
@@ -197,7 +202,7 @@
           </w:tcPr>
           <w:p>
             <w:r>
-              <w:t>J1-J2</w:t>
+              <w:t>Lun 7 (soir) → Mar 8</w:t>
             </w:r>
           </w:p>
         </w:tc>
@@ -207,7 +212,7 @@
           </w:tcPr>
           <w:p>
             <w:r>
-              <w:t>1,5 j</w:t>
+              <w:t>5 h</w:t>
             </w:r>
           </w:p>
         </w:tc>
@@ -239,7 +244,7 @@
           </w:tcPr>
           <w:p>
             <w:r>
-              <w:t>J2-J3</w:t>
+              <w:t>Mar 8 sept</w:t>
             </w:r>
           </w:p>
         </w:tc>
@@ -249,7 +254,7 @@
           </w:tcPr>
           <w:p>
             <w:r>
-              <w:t>1 j</w:t>
+              <w:t>3 h</w:t>
             </w:r>
           </w:p>
         </w:tc>
@@ -271,7 +276,7 @@
           </w:tcPr>
           <w:p>
             <w:r>
-              <w:t>Page Connexion : remplacer la phrase située sous le logo</w:t>
+              <w:t>Page Connexion : remplacer la phrase située sous le logo (texte validé en amont par l'équipe)</w:t>
             </w:r>
           </w:p>
         </w:tc>
@@ -281,7 +286,7 @@
           </w:tcPr>
           <w:p>
             <w:r>
-              <w:t>J3</w:t>
+              <w:t>Mar 8 sept</w:t>
             </w:r>
           </w:p>
         </w:tc>
@@ -291,7 +296,7 @@
           </w:tcPr>
           <w:p>
             <w:r>
-              <w:t>0,25 j</w:t>
+              <w:t>30 min</w:t>
             </w:r>
           </w:p>
         </w:tc>
@@ -301,7 +306,7 @@
           </w:tcPr>
           <w:p>
             <w:r>
-              <w:t>Texte actuel jugé à revoir par l'équipe (nouveau texte à valider en amont du sprint pour ne pas bloquer cette tâche).</w:t>
+              <w:t>Texte actuel jugé à revoir ; le choisir avant le sprint évite tout temps d'attente ici.</w:t>
             </w:r>
           </w:p>
         </w:tc>
@@ -313,7 +318,7 @@
           </w:tcPr>
           <w:p>
             <w:r>
-              <w:t>Page Connexion : ajouter un loader / spinner après validation de la connexion, jusqu'à l'arrivée sur le Dashboard</w:t>
+              <w:t>Page Connexion : ajouter un loader / spinner après validation, jusqu'à l'arrivée sur le Dashboard</w:t>
             </w:r>
           </w:p>
         </w:tc>
@@ -323,7 +328,7 @@
           </w:tcPr>
           <w:p>
             <w:r>
-              <w:t>J3</w:t>
+              <w:t>Mar 8 sept</w:t>
             </w:r>
           </w:p>
         </w:tc>
@@ -333,7 +338,7 @@
           </w:tcPr>
           <w:p>
             <w:r>
-              <w:t>0,5 j</w:t>
+              <w:t>1 h 30</w:t>
             </w:r>
           </w:p>
         </w:tc>
@@ -343,7 +348,7 @@
           </w:tcPr>
           <w:p>
             <w:r>
-              <w:t>Donner un retour visuel pendant l'authentification, éviter une impression de blocage de l'application.</w:t>
+              <w:t>Retour visuel pendant l'authentification, évite une impression de blocage.</w:t>
             </w:r>
           </w:p>
         </w:tc>
@@ -355,7 +360,7 @@
           </w:tcPr>
           <w:p>
             <w:r>
-              <w:t>Page Création de compte : ajouter le logo de l'application dans le formulaire</w:t>
+              <w:t>Page Création de compte : ajouter le logo de l'application</w:t>
             </w:r>
           </w:p>
         </w:tc>
@@ -365,7 +370,7 @@
           </w:tcPr>
           <w:p>
             <w:r>
-              <w:t>J4</w:t>
+              <w:t>Mar 8 sept</w:t>
             </w:r>
           </w:p>
         </w:tc>
@@ -375,7 +380,7 @@
           </w:tcPr>
           <w:p>
             <w:r>
-              <w:t>0,25 j</w:t>
+              <w:t>30 min</w:t>
             </w:r>
           </w:p>
         </w:tc>
@@ -397,7 +402,7 @@
           </w:tcPr>
           <w:p>
             <w:r>
-              <w:t>Page Création de compte : séparer le champ "Nom complet" en deux champs distincts "Nom" et "Prénom"</w:t>
+              <w:t>Page Création de compte : séparer "Nom complet" en "Nom" et "Prénom"</w:t>
             </w:r>
           </w:p>
         </w:tc>
@@ -407,7 +412,7 @@
           </w:tcPr>
           <w:p>
             <w:r>
-              <w:t>J4</w:t>
+              <w:t>Mar 8 sept</w:t>
             </w:r>
           </w:p>
         </w:tc>
@@ -417,7 +422,7 @@
           </w:tcPr>
           <w:p>
             <w:r>
-              <w:t>0,5 j</w:t>
+              <w:t>1 h</w:t>
             </w:r>
           </w:p>
         </w:tc>
@@ -427,7 +432,7 @@
           </w:tcPr>
           <w:p>
             <w:r>
-              <w:t>Cohérence avec le formulaire Nouvelle demande (déjà 2 champs distincts) et avec la structure des données côté Supabase.</w:t>
+              <w:t>Cohérence avec le formulaire Nouvelle demande et la structure des données Supabase.</w:t>
             </w:r>
           </w:p>
         </w:tc>
@@ -449,7 +454,7 @@
           </w:tcPr>
           <w:p>
             <w:r>
-              <w:t>J4</w:t>
+              <w:t>Mar 8 sept</w:t>
             </w:r>
           </w:p>
         </w:tc>
@@ -459,7 +464,7 @@
           </w:tcPr>
           <w:p>
             <w:r>
-              <w:t>0,25 j</w:t>
+              <w:t>30 min</w:t>
             </w:r>
           </w:p>
         </w:tc>
@@ -481,7 +486,7 @@
           </w:tcPr>
           <w:p>
             <w:r>
-              <w:t>Dashboard : retirer l'emoji main après le texte "Bienvenue…"</w:t>
+              <w:t>Dashboard : retirer l'emoji main après "Bienvenue…"</w:t>
             </w:r>
           </w:p>
         </w:tc>
@@ -491,7 +496,7 @@
           </w:tcPr>
           <w:p>
             <w:r>
-              <w:t>J5</w:t>
+              <w:t>Mar 8 sept (soir)</w:t>
             </w:r>
           </w:p>
         </w:tc>
@@ -501,7 +506,7 @@
           </w:tcPr>
           <w:p>
             <w:r>
-              <w:t>0,25 j</w:t>
+              <w:t>15 min</w:t>
             </w:r>
           </w:p>
         </w:tc>
@@ -511,7 +516,7 @@
           </w:tcPr>
           <w:p>
             <w:r>
-              <w:t>Renforcer le professionnalisme perçu de l'interface.</w:t>
+              <w:t>Renforcer le professionnalisme perçu.</w:t>
             </w:r>
           </w:p>
         </w:tc>
@@ -533,7 +538,7 @@
           </w:tcPr>
           <w:p>
             <w:r>
-              <w:t>J5</w:t>
+              <w:t>Mar 8 sept (soir)</w:t>
             </w:r>
           </w:p>
         </w:tc>
@@ -543,7 +548,7 @@
           </w:tcPr>
           <w:p>
             <w:r>
-              <w:t>0,25 j</w:t>
+              <w:t>30 min</w:t>
             </w:r>
           </w:p>
         </w:tc>
@@ -565,7 +570,7 @@
           </w:tcPr>
           <w:p>
             <w:r>
-              <w:t>Page Historique : ajouter la colonne "Nom du demandeur" et implémenter la recherche par ce champ</w:t>
+              <w:t>Page Historique : ajouter la colonne "Nom du demandeur" et la recherche par ce champ</w:t>
             </w:r>
           </w:p>
         </w:tc>
@@ -575,7 +580,7 @@
           </w:tcPr>
           <w:p>
             <w:r>
-              <w:t>J5</w:t>
+              <w:t>Mar 8 (soir) → Mer 9 (matin)</w:t>
             </w:r>
           </w:p>
         </w:tc>
@@ -585,7 +590,7 @@
           </w:tcPr>
           <w:p>
             <w:r>
-              <w:t>0,75 j</w:t>
+              <w:t>2 h</w:t>
             </w:r>
           </w:p>
         </w:tc>
@@ -595,7 +600,7 @@
           </w:tcPr>
           <w:p>
             <w:r>
-              <w:t>Retrouver rapidement un dossier sans parcourir toute la liste ; cohérence avec le Dashboard.</w:t>
+              <w:t>Retrouver rapidement un dossier ; cohérence avec le Dashboard.</w:t>
             </w:r>
           </w:p>
         </w:tc>
@@ -603,7 +608,7 @@
     </w:tbl>
     <w:p>
       <w:r>
-        <w:t>Total : ~5 jours. Fin de bloc : Marie-Thérèse pousse son code sur sa branche, ouvre sa Pull Request, et prévient Andy que la main est passée.</w:t>
+        <w:t>Total : ~16 h (≈ 2 jours). Fin de bloc mercredi 9 sept au matin : Marie-Thérèse pousse son code, ouvre sa Pull Request, prévient Andy.</w:t>
       </w:r>
     </w:p>
     <w:p>
@@ -611,12 +616,12 @@
         <w:pStyle w:val="Heading1"/>
       </w:pPr>
       <w:r>
-        <w:t>2. Andy (avec l'aide de Claude) — Jours 6 à 8</w:t>
+        <w:t>2. Andy (avec l'aide de Claude) — mercredi 9 septembre</w:t>
       </w:r>
     </w:p>
     <w:p>
       <w:r>
-        <w:t>Démarre par un pull des changements de Marie-Thérèse. Objectif de son bloc : SHAP (son domaine), plus les items du formulaire, et l'étude conditionnelle du multilingue en dernier.</w:t>
+        <w:t>Démarre par un pull des changements de Marie-Thérèse dès réception de sa Pull Request. Objectif de son bloc : SHAP, formulaire, et le multilingue en dernier, strictement conditionnel.</w:t>
       </w:r>
     </w:p>
     <w:tbl>
@@ -648,7 +653,7 @@
           </w:tcPr>
           <w:p>
             <w:r>
-              <w:t>Jour</w:t>
+              <w:t>Moment</w:t>
             </w:r>
           </w:p>
         </w:tc>
@@ -680,7 +685,7 @@
           </w:tcPr>
           <w:p>
             <w:r>
-              <w:t>Pull des changements de Marie-Thérèse avant de démarrer</w:t>
+              <w:t>Pull des changements de Marie-Thérèse</w:t>
             </w:r>
           </w:p>
         </w:tc>
@@ -690,7 +695,7 @@
           </w:tcPr>
           <w:p>
             <w:r>
-              <w:t>J6 (matin)</w:t>
+              <w:t>Mer 9 sept (matin)</w:t>
             </w:r>
           </w:p>
         </w:tc>
@@ -700,7 +705,7 @@
           </w:tcPr>
           <w:p>
             <w:r>
-              <w:t>—</w:t>
+              <w:t>15 min</w:t>
             </w:r>
           </w:p>
         </w:tc>
@@ -710,7 +715,7 @@
           </w:tcPr>
           <w:p>
             <w:r>
-              <w:t>Repartir d'un code à jour, éviter de travailler sur une version obsolète.</w:t>
+              <w:t>Repartir d'un code à jour.</w:t>
             </w:r>
           </w:p>
         </w:tc>
@@ -722,7 +727,7 @@
           </w:tcPr>
           <w:p>
             <w:r>
-              <w:t>Page Résultat : créer un bouton "Facteurs explicatifs SHAP" qui affiche les graphiques SHAP à la demande (masqués par défaut à l'arrivée sur la page)</w:t>
+              <w:t>Page Résultat : bouton "Facteurs explicatifs SHAP" qui affiche les graphiques SHAP à la demande (masqués par défaut)</w:t>
             </w:r>
           </w:p>
         </w:tc>
@@ -732,7 +737,7 @@
           </w:tcPr>
           <w:p>
             <w:r>
-              <w:t>J6</w:t>
+              <w:t>Mer 9 sept</w:t>
             </w:r>
           </w:p>
         </w:tc>
@@ -742,7 +747,7 @@
           </w:tcPr>
           <w:p>
             <w:r>
-              <w:t>1 j</w:t>
+              <w:t>4 h</w:t>
             </w:r>
           </w:p>
         </w:tc>
@@ -752,7 +757,7 @@
           </w:tcPr>
           <w:p>
             <w:r>
-              <w:t>Les graphiques SHAP sont jugés inutiles en affichage direct pour un utilisateur non technique, mais potentiellement utiles pour un profil plus expert : les rendre accessibles à la demande plutôt que de les retirer.</w:t>
+              <w:t>Jugés inutiles en affichage direct pour un utilisateur non technique, potentiellement utiles pour un profil expert : accessibles à la demande plutôt que retirés.</w:t>
             </w:r>
           </w:p>
         </w:tc>
@@ -764,7 +769,7 @@
           </w:tcPr>
           <w:p>
             <w:r>
-              <w:t>Formulaire Nouvelle demande : retirer les emojis "générés par IA"</w:t>
+              <w:t>Formulaire : retirer les emojis "générés par IA"</w:t>
             </w:r>
           </w:p>
         </w:tc>
@@ -774,7 +779,7 @@
           </w:tcPr>
           <w:p>
             <w:r>
-              <w:t>J7</w:t>
+              <w:t>Mer 9 sept</w:t>
             </w:r>
           </w:p>
         </w:tc>
@@ -784,7 +789,7 @@
           </w:tcPr>
           <w:p>
             <w:r>
-              <w:t>0,25 j</w:t>
+              <w:t>15 min</w:t>
             </w:r>
           </w:p>
         </w:tc>
@@ -794,7 +799,7 @@
           </w:tcPr>
           <w:p>
             <w:r>
-              <w:t>Renforcer le professionnalisme perçu de l'interface.</w:t>
+              <w:t>Renforcer le professionnalisme perçu.</w:t>
             </w:r>
           </w:p>
         </w:tc>
@@ -806,7 +811,7 @@
           </w:tcPr>
           <w:p>
             <w:r>
-              <w:t>Formulaire Nouvelle demande : retirer les champs "Mobile Money" et "Membre Tontine"</w:t>
+              <w:t>Formulaire : retirer "Mobile Money" et "Membre Tontine"</w:t>
             </w:r>
           </w:p>
         </w:tc>
@@ -816,7 +821,7 @@
           </w:tcPr>
           <w:p>
             <w:r>
-              <w:t>J7</w:t>
+              <w:t>Mer 9 sept</w:t>
             </w:r>
           </w:p>
         </w:tc>
@@ -826,7 +831,7 @@
           </w:tcPr>
           <w:p>
             <w:r>
-              <w:t>0,25 j</w:t>
+              <w:t>15 min</w:t>
             </w:r>
           </w:p>
         </w:tc>
@@ -836,7 +841,7 @@
           </w:tcPr>
           <w:p>
             <w:r>
-              <w:t>Simplifier le formulaire (champs jugés superflus par l'équipe).</w:t>
+              <w:t>Simplifier le formulaire (champs jugés superflus).</w:t>
             </w:r>
           </w:p>
         </w:tc>
@@ -848,7 +853,7 @@
           </w:tcPr>
           <w:p>
             <w:r>
-              <w:t>Formulaire Nouvelle demande : si "Objet du prêt" ou "Secteur d'activité" = "Autre", afficher un champ texte de justification</w:t>
+              <w:t>Formulaire : si "Objet du prêt" ou "Secteur d'activité" = "Autre", afficher un champ texte de justification</w:t>
             </w:r>
           </w:p>
         </w:tc>
@@ -858,7 +863,7 @@
           </w:tcPr>
           <w:p>
             <w:r>
-              <w:t>J7</w:t>
+              <w:t>Mer 9 sept</w:t>
             </w:r>
           </w:p>
         </w:tc>
@@ -868,7 +873,7 @@
           </w:tcPr>
           <w:p>
             <w:r>
-              <w:t>0,5 j</w:t>
+              <w:t>2 h</w:t>
             </w:r>
           </w:p>
         </w:tc>
@@ -878,7 +883,7 @@
           </w:tcPr>
           <w:p>
             <w:r>
-              <w:t>Éviter la perte d'information quand aucune catégorie prédéfinie ne correspond au dossier.</w:t>
+              <w:t>Éviter la perte d'information quand aucune catégorie prédéfinie ne correspond.</w:t>
             </w:r>
           </w:p>
         </w:tc>
@@ -890,7 +895,7 @@
           </w:tcPr>
           <w:p>
             <w:r>
-              <w:t>Dashboard : étudier la faisabilité d'une gestion multilingue — à implémenter uniquement si aucun risque de complication n'est identifié (feature conditionnelle, non bloquante pour la suite)</w:t>
+              <w:t>Dashboard : étudier la faisabilité d'une gestion multilingue — implémentée seulement si aucun risque de complication</w:t>
             </w:r>
           </w:p>
         </w:tc>
@@ -900,7 +905,7 @@
           </w:tcPr>
           <w:p>
             <w:r>
-              <w:t>J8</w:t>
+              <w:t>Mer 9 sept (soir)</w:t>
             </w:r>
           </w:p>
         </w:tc>
@@ -910,7 +915,7 @@
           </w:tcPr>
           <w:p>
             <w:r>
-              <w:t>1 j (plafonné)</w:t>
+              <w:t>3 h max</w:t>
             </w:r>
           </w:p>
         </w:tc>
@@ -920,7 +925,7 @@
           </w:tcPr>
           <w:p>
             <w:r>
-              <w:t>Explicitement conditionnel : ne pas retarder la passation à Aristide si la complexité s'avère trop élevée — dans ce cas, documenter le blocage et passer la main quand même.</w:t>
+              <w:t>Conditionnel et plafonné : si trop complexe, documenter et passer la main sans attendre — ne doit pas faire déraper le calendrier.</w:t>
             </w:r>
           </w:p>
         </w:tc>
@@ -928,7 +933,7 @@
     </w:tbl>
     <w:p>
       <w:r>
-        <w:t>Total : ~3 jours (dont 1 jour conditionnel, plafonné, pour le multilingue). Fin de bloc : Andy pousse son code, ouvre sa Pull Request, et prévient Aristide que la main est passée.</w:t>
+        <w:t>Total : ~10 h (≈ 1,5 jour, plafonné). Fin de bloc mercredi 9 sept en soirée ou jeudi 10 sept au matin au plus tard : Andy pousse son code, ouvre sa Pull Request, prévient Aristide.</w:t>
       </w:r>
     </w:p>
     <w:p>
@@ -936,12 +941,12 @@
         <w:pStyle w:val="Heading1"/>
       </w:pPr>
       <w:r>
-        <w:t>3. Aristide (avec l'aide de Claude) — Jours 9 à 11 — clôture le sprint</w:t>
+        <w:t>3. Aristide (avec l'aide de Claude) — jeu 10 → ven 11 sept — clôture le sprint</w:t>
       </w:r>
     </w:p>
     <w:p>
       <w:r>
-        <w:t>Démarre par un pull des changements de Marie-Thérèse et d'Andy. Objectif de son bloc : cohérence des couleurs de score entre pages, export PDF, terminologie liée aux données/au modèle, et le footer global — volontairement en dernier car transverse à toutes les pages désormais stabilisées.</w:t>
+        <w:t>Démarre par un pull des changements de Marie-Thérèse et d'Andy. Objectif de son bloc : cohérence des couleurs de score, export PDF, terminologie liée au modèle, et le footer global — en dernier car transverse à toutes les pages désormais stabilisées.</w:t>
       </w:r>
     </w:p>
     <w:tbl>
@@ -973,7 +978,7 @@
           </w:tcPr>
           <w:p>
             <w:r>
-              <w:t>Jour</w:t>
+              <w:t>Moment</w:t>
             </w:r>
           </w:p>
         </w:tc>
@@ -1005,7 +1010,7 @@
           </w:tcPr>
           <w:p>
             <w:r>
-              <w:t>Pull des changements de Marie-Thérèse et d'Andy avant de démarrer</w:t>
+              <w:t>Pull des changements de Marie-Thérèse et d'Andy</w:t>
             </w:r>
           </w:p>
         </w:tc>
@@ -1015,7 +1020,7 @@
           </w:tcPr>
           <w:p>
             <w:r>
-              <w:t>J9 (matin)</w:t>
+              <w:t>Jeu 10 sept (matin)</w:t>
             </w:r>
           </w:p>
         </w:tc>
@@ -1025,7 +1030,7 @@
           </w:tcPr>
           <w:p>
             <w:r>
-              <w:t>—</w:t>
+              <w:t>15 min</w:t>
             </w:r>
           </w:p>
         </w:tc>
@@ -1035,7 +1040,7 @@
           </w:tcPr>
           <w:p>
             <w:r>
-              <w:t>Repartir d'un code à jour, éviter de travailler sur une version obsolète.</w:t>
+              <w:t>Repartir d'un code à jour.</w:t>
             </w:r>
           </w:p>
         </w:tc>
@@ -1047,7 +1052,7 @@
           </w:tcPr>
           <w:p>
             <w:r>
-              <w:t>Formulaire Nouvelle demande : corriger le remplissage automatique du champ "Niveau d'éducation" pour les profils à risque</w:t>
+              <w:t>Formulaire : corriger le remplissage automatique du "Niveau d'éducation" pour les profils à risque</w:t>
             </w:r>
           </w:p>
         </w:tc>
@@ -1057,7 +1062,7 @@
           </w:tcPr>
           <w:p>
             <w:r>
-              <w:t>J9</w:t>
+              <w:t>Jeu 10 sept</w:t>
             </w:r>
           </w:p>
         </w:tc>
@@ -1067,7 +1072,7 @@
           </w:tcPr>
           <w:p>
             <w:r>
-              <w:t>0,5 j</w:t>
+              <w:t>1 h 30</w:t>
             </w:r>
           </w:p>
         </w:tc>
@@ -1077,7 +1082,7 @@
           </w:tcPr>
           <w:p>
             <w:r>
-              <w:t>Un profil de démonstration doit rester cohérent avec son scénario ; l'erreur actuelle nuit à la crédibilité des exemples affichés aux utilisateurs.</w:t>
+              <w:t>Un profil de démonstration doit rester cohérent avec son scénario.</w:t>
             </w:r>
           </w:p>
         </w:tc>
@@ -1089,7 +1094,7 @@
           </w:tcPr>
           <w:p>
             <w:r>
-              <w:t>Formulaire Nouvelle demande : retirer la mention "Mode : ML prédictif"</w:t>
+              <w:t>Formulaire : retirer la mention "Mode : ML prédictif"</w:t>
             </w:r>
           </w:p>
         </w:tc>
@@ -1099,7 +1104,7 @@
           </w:tcPr>
           <w:p>
             <w:r>
-              <w:t>J9</w:t>
+              <w:t>Jeu 10 sept</w:t>
             </w:r>
           </w:p>
         </w:tc>
@@ -1109,7 +1114,7 @@
           </w:tcPr>
           <w:p>
             <w:r>
-              <w:t>0,25 j</w:t>
+              <w:t>15 min</w:t>
             </w:r>
           </w:p>
         </w:tc>
@@ -1131,7 +1136,7 @@
           </w:tcPr>
           <w:p>
             <w:r>
-              <w:t>Formulaire Nouvelle demande : retirer la section "Prédiction en temps réel"</w:t>
+              <w:t>Formulaire : retirer la section "Prédiction en temps réel"</w:t>
             </w:r>
           </w:p>
         </w:tc>
@@ -1141,7 +1146,7 @@
           </w:tcPr>
           <w:p>
             <w:r>
-              <w:t>J9</w:t>
+              <w:t>Jeu 10 sept</w:t>
             </w:r>
           </w:p>
         </w:tc>
@@ -1151,7 +1156,7 @@
           </w:tcPr>
           <w:p>
             <w:r>
-              <w:t>0,5 j</w:t>
+              <w:t>1 h 30</w:t>
             </w:r>
           </w:p>
         </w:tc>
@@ -1161,7 +1166,7 @@
           </w:tcPr>
           <w:p>
             <w:r>
-              <w:t>Jugée peu utile pendant la saisie pour un utilisateur non technique ; le résultat officiel reste affiché sur la page Résultat après validation.</w:t>
+              <w:t>Jugée peu utile pendant la saisie ; le résultat officiel reste sur la page Résultat.</w:t>
             </w:r>
           </w:p>
         </w:tc>
@@ -1173,7 +1178,7 @@
           </w:tcPr>
           <w:p>
             <w:r>
-              <w:t>Dashboard et Historique : adapter la couleur de la barre/jauge de score à la décision (vert / orange / rouge), via une fonction utilitaire commune aux deux pages</w:t>
+              <w:t>Dashboard et Historique : couleur de la jauge/score selon la décision (vert / orange / rouge), fonction commune aux deux pages</w:t>
             </w:r>
           </w:p>
         </w:tc>
@@ -1183,7 +1188,7 @@
           </w:tcPr>
           <w:p>
             <w:r>
-              <w:t>J10</w:t>
+              <w:t>Jeu 10 (soir) → Ven 11</w:t>
             </w:r>
           </w:p>
         </w:tc>
@@ -1193,7 +1198,7 @@
           </w:tcPr>
           <w:p>
             <w:r>
-              <w:t>0,75 j</w:t>
+              <w:t>2 h 30</w:t>
             </w:r>
           </w:p>
         </w:tc>
@@ -1203,7 +1208,7 @@
           </w:tcPr>
           <w:p>
             <w:r>
-              <w:t>Cohérence visuelle immédiate entre les deux pages qui affichent un score ; une fonction commune évite que les deux pages divergent.</w:t>
+              <w:t>Cohérence visuelle entre les deux pages ; une fonction commune évite toute divergence.</w:t>
             </w:r>
           </w:p>
         </w:tc>
@@ -1225,7 +1230,7 @@
           </w:tcPr>
           <w:p>
             <w:r>
-              <w:t>J10</w:t>
+              <w:t>Ven 11 sept</w:t>
             </w:r>
           </w:p>
         </w:tc>
@@ -1235,7 +1240,7 @@
           </w:tcPr>
           <w:p>
             <w:r>
-              <w:t>0,25 j</w:t>
+              <w:t>15 min</w:t>
             </w:r>
           </w:p>
         </w:tc>
@@ -1257,7 +1262,7 @@
           </w:tcPr>
           <w:p>
             <w:r>
-              <w:t>Page Export PDF : supprimer "Microfinance XYZ" de l'en-tête de l'aperçu, renommer "Catégorie" en "Catégorie de risque"</w:t>
+              <w:t>Export PDF : supprimer "Microfinance XYZ" de l'en-tête, renommer "Catégorie" en "Catégorie de risque"</w:t>
             </w:r>
           </w:p>
         </w:tc>
@@ -1267,7 +1272,7 @@
           </w:tcPr>
           <w:p>
             <w:r>
-              <w:t>J10</w:t>
+              <w:t>Ven 11 sept</w:t>
             </w:r>
           </w:p>
         </w:tc>
@@ -1277,7 +1282,7 @@
           </w:tcPr>
           <w:p>
             <w:r>
-              <w:t>0,5 j</w:t>
+              <w:t>1 h 30</w:t>
             </w:r>
           </w:p>
         </w:tc>
@@ -1287,7 +1292,7 @@
           </w:tcPr>
           <w:p>
             <w:r>
-              <w:t>Éviter un nom d'institution fictif visible sur un document destiné à être partagé avec un client ; clarté du libellé.</w:t>
+              <w:t>Éviter un nom d'institution fictif sur un document partageable ; clarté du libellé.</w:t>
             </w:r>
           </w:p>
         </w:tc>
@@ -1299,7 +1304,7 @@
           </w:tcPr>
           <w:p>
             <w:r>
-              <w:t>Ajouter un footer global (copyright, version de l'app, nom de l'app), visible sur toutes les pages</w:t>
+              <w:t>Ajouter un footer global (copyright, version, nom de l'app)</w:t>
             </w:r>
           </w:p>
         </w:tc>
@@ -1309,7 +1314,7 @@
           </w:tcPr>
           <w:p>
             <w:r>
-              <w:t>J11</w:t>
+              <w:t>Ven 11 sept</w:t>
             </w:r>
           </w:p>
         </w:tc>
@@ -1319,7 +1324,7 @@
           </w:tcPr>
           <w:p>
             <w:r>
-              <w:t>0,5 j</w:t>
+              <w:t>1 h 30</w:t>
             </w:r>
           </w:p>
         </w:tc>
@@ -1329,7 +1334,7 @@
           </w:tcPr>
           <w:p>
             <w:r>
-              <w:t>Élément transverse à toutes les pages : fait en dernier, une fois les textes de tout le monde stabilisés, pour éviter les retouches répétées.</w:t>
+              <w:t>Transverse à toutes les pages : fait en dernier, une fois les textes de tout le monde stabilisés.</w:t>
             </w:r>
           </w:p>
         </w:tc>
@@ -1337,7 +1342,7 @@
     </w:tbl>
     <w:p>
       <w:r>
-        <w:t>Total : ~3 jours. Fin de bloc : Aristide pousse son code, intègre l'ensemble via Pull Request vers main — clôture du sprint.</w:t>
+        <w:t>Total : ~9 h (≈ 1,5 jour). Fin de bloc vendredi 11 septembre : Aristide pousse son code, intègre l'ensemble via Pull Request vers main — clôture du sprint.</w:t>
       </w:r>
     </w:p>
     <w:p>
@@ -1353,7 +1358,7 @@
         <w:pStyle w:val="ListBullet"/>
       </w:pPr>
       <w:r>
-        <w:t>Un seul membre modifie app/app_v2.py à la fois — pas de travail en parallèle sur le code cette fois-ci, contrairement à la semaine de marge : le calendrier est plus long, mais aucun conflit de fusion n'est possible.</w:t>
+        <w:t>Calendrier cible : lundi 7 septembre (soir) → vendredi 11 septembre 2026, soit 5 jours calendaires. Limite absolue : lundi 14 septembre (1 semaine), à ne dépasser sous aucun prétexte.</w:t>
       </w:r>
     </w:p>
     <w:p>
@@ -1361,7 +1366,7 @@
         <w:pStyle w:val="ListBullet"/>
       </w:pPr>
       <w:r>
-        <w:t>Chaque bloc se termine par un push explicite (et une Pull Request) avant la passation ; le membre suivant démarre systématiquement par un pull, jamais sur une copie locale non synchronisée.</w:t>
+        <w:t>Un seul membre modifie app/app_v2.py à la fois — aucun travail en parallèle sur le code, pour exclure tout conflit de fusion malgré le calendrier resserré.</w:t>
       </w:r>
     </w:p>
     <w:p>
@@ -1369,7 +1374,7 @@
         <w:pStyle w:val="ListBullet"/>
       </w:pPr>
       <w:r>
-        <w:t>"Mot de passe oublié" (Marie-Thérèse) dépend de ce que permet Supabase — à valider dès J1 avant d'estimer plus précisément la suite de son bloc ; un retard ici décale tout le calendrier.</w:t>
+        <w:t>Chaque bloc se termine par un push explicite (et une Pull Request) avant la passation ; le membre suivant démarre par un pull dès réception, sans délai d'attente.</w:t>
       </w:r>
     </w:p>
     <w:p>
@@ -1377,7 +1382,7 @@
         <w:pStyle w:val="ListBullet"/>
       </w:pPr>
       <w:r>
-        <w:t>Le texte sous le logo de la page de connexion doit être choisi par l'équipe avant J1, pour ne pas bloquer Marie-Thérèse en cours de bloc.</w:t>
+        <w:t>"Mot de passe oublié" dépend de ce que permet Supabase — à valider dès ce soir (lundi) par Marie-Thérèse, avant toute autre tâche de son bloc.</w:t>
       </w:r>
     </w:p>
     <w:p>
@@ -1385,7 +1390,23 @@
         <w:pStyle w:val="ListBullet"/>
       </w:pPr>
       <w:r>
-        <w:t>Le multilingue (Andy, J8) reste conditionnel et plafonné à 1 jour : s'il n'est pas concluant, Andy documente le blocage et passe la main à Aristide sans attendre — la fin du sprint ne doit pas glisser à cause de cet item.</w:t>
+        <w:t>Le texte sous le logo de la page de connexion doit être choisi par l'équipe avant ce soir, pour ne pas faire perdre de temps à Marie-Thérèse en cours de bloc.</w:t>
+      </w:r>
+    </w:p>
+    <w:p>
+      <w:pPr>
+        <w:pStyle w:val="ListBullet"/>
+      </w:pPr>
+      <w:r>
+        <w:t>Le multilingue (Andy) reste conditionnel et plafonné à 3 h : s'il n'est pas concluant, Andy documente le blocage et passe la main à Aristide immédiatement — cet item ne doit jamais faire déraper le calendrier serré.</w:t>
+      </w:r>
+    </w:p>
+    <w:p>
+      <w:pPr>
+        <w:pStyle w:val="ListBullet"/>
+      </w:pPr>
+      <w:r>
+        <w:t>Réactivité attendue de chaque membre : répondre/pousser dans la foulée de la fin de son bloc, sans attendre le lendemain, pour tenir l'objectif de 5 jours.</w:t>
       </w:r>
     </w:p>
     <w:p>
@@ -1398,7 +1419,7 @@
     </w:p>
     <w:p>
       <w:r>
-        <w:t>Point d'avancement à chaque passation (fin de bloc de Marie-Thérèse, fin de bloc d'Andy) : rapide validation de ce qui a été fait avant que le membre suivant ne démarre, pour repartir sur une base commune claire.</w:t>
+        <w:t>Point d'avancement rapide à chaque passation (fin de bloc de Marie-Thérèse mercredi matin, fin de bloc d'Andy jeudi matin) : validation express de ce qui a été fait avant que le membre suivant ne démarre.</w:t>
       </w:r>
     </w:p>
     <w:p>
@@ -1411,7 +1432,7 @@
     </w:p>
     <w:p>
       <w:r>
-        <w:t>Application avec :</w:t>
+        <w:t>Application avec, au plus tard vendredi 11 septembre 2026 :</w:t>
       </w:r>
     </w:p>
     <w:p>

</xml_diff>